<commit_message>
feat: implement CRUD functionality for sports module including database migrations and service layer logic
</commit_message>
<xml_diff>
--- a/docs/juara-league-brd.docx
+++ b/docs/juara-league-brd.docx
@@ -6801,7 +6801,1993 @@
           <w:sz w:val="32"/>
           <w:szCs w:val="32"/>
         </w:rPr>
-        <w:t xml:space="preserve">7. Roadmap Produk</w:t>
+        <w:t xml:space="preserve">7. Model Monetisasi</w:t>
+      </w:r>
+    </w:p>
+    <w:p>
+      <w:pPr>
+        <w:pStyle w:val="Heading2"/>
+        <w:spacing w:before="320" w:after="160"/>
+      </w:pPr>
+      <w:r>
+        <w:rPr>
+          <w:rFonts w:ascii="Arial" w:cs="Arial" w:eastAsia="Arial" w:hAnsi="Arial"/>
+          <w:b/>
+          <w:bCs/>
+          <w:color w:val="111827"/>
+          <w:sz w:val="26"/>
+          <w:szCs w:val="26"/>
+        </w:rPr>
+        <w:t xml:space="preserve">7.1 Tier Pengguna</w:t>
+      </w:r>
+    </w:p>
+    <w:p>
+      <w:pPr>
+        <w:spacing w:before="80" w:after="80"/>
+      </w:pPr>
+      <w:r>
+        <w:rPr>
+          <w:rFonts w:ascii="Arial" w:cs="Arial" w:eastAsia="Arial" w:hAnsi="Arial"/>
+          <w:color w:val="111827"/>
+          <w:sz w:val="22"/>
+          <w:szCs w:val="22"/>
+        </w:rPr>
+        <w:t xml:space="preserve">Juara League menggunakan model freemium — semua fitur turnamen tersedia di tier gratis, dengan perbedaan pada kuota, kecepatan approval, dan branding platform.</w:t>
+      </w:r>
+    </w:p>
+    <w:p>
+      <w:pPr>
+        <w:spacing w:before="0" w:after="0"/>
+      </w:pPr>
+      <w:r>
+        <w:rPr>
+          <w:rFonts w:ascii="Arial" w:cs="Arial" w:eastAsia="Arial" w:hAnsi="Arial"/>
+          <w:sz w:val="22"/>
+          <w:szCs w:val="22"/>
+        </w:rPr>
+        <w:t xml:space="preserve"/>
+      </w:r>
+    </w:p>
+    <w:tbl>
+      <w:tblPr>
+        <w:tblW w:type="dxa" w:w="9360"/>
+        <w:tblBorders>
+          <w:top w:val="single" w:color="auto" w:sz="4"/>
+          <w:left w:val="single" w:color="auto" w:sz="4"/>
+          <w:bottom w:val="single" w:color="auto" w:sz="4"/>
+          <w:right w:val="single" w:color="auto" w:sz="4"/>
+          <w:insideH w:val="single" w:color="auto" w:sz="4"/>
+          <w:insideV w:val="single" w:color="auto" w:sz="4"/>
+        </w:tblBorders>
+      </w:tblPr>
+      <w:tblGrid>
+        <w:gridCol w:w="4000"/>
+        <w:gridCol w:w="2400"/>
+        <w:gridCol w:w="2960"/>
+      </w:tblGrid>
+      <w:tr>
+        <w:trPr>
+          <w:tblHeader/>
+        </w:trPr>
+        <w:tc>
+          <w:tcPr>
+            <w:tcW w:type="dxa" w:w="4000"/>
+            <w:tcBorders>
+              <w:top w:val="single" w:color="E5E7EB" w:sz="1"/>
+              <w:left w:val="single" w:color="E5E7EB" w:sz="1"/>
+              <w:bottom w:val="single" w:color="E5E7EB" w:sz="1"/>
+              <w:right w:val="single" w:color="E5E7EB" w:sz="1"/>
+            </w:tcBorders>
+            <w:shd w:fill="1A56DB" w:val="clear"/>
+            <w:tcMar>
+              <w:top w:type="dxa" w:w="100"/>
+              <w:left w:type="dxa" w:w="120"/>
+              <w:bottom w:type="dxa" w:w="100"/>
+              <w:right w:type="dxa" w:w="120"/>
+            </w:tcMar>
+          </w:tcPr>
+          <w:p>
+            <w:r>
+              <w:rPr>
+                <w:rFonts w:ascii="Arial" w:cs="Arial" w:eastAsia="Arial" w:hAnsi="Arial"/>
+                <w:b/>
+                <w:bCs/>
+                <w:color w:val="FFFFFF"/>
+                <w:sz w:val="20"/>
+                <w:szCs w:val="20"/>
+              </w:rPr>
+              <w:t xml:space="preserve">Fitur</w:t>
+            </w:r>
+          </w:p>
+        </w:tc>
+        <w:tc>
+          <w:tcPr>
+            <w:tcW w:type="dxa" w:w="2400"/>
+            <w:tcBorders>
+              <w:top w:val="single" w:color="E5E7EB" w:sz="1"/>
+              <w:left w:val="single" w:color="E5E7EB" w:sz="1"/>
+              <w:bottom w:val="single" w:color="E5E7EB" w:sz="1"/>
+              <w:right w:val="single" w:color="E5E7EB" w:sz="1"/>
+            </w:tcBorders>
+            <w:shd w:fill="1A56DB" w:val="clear"/>
+            <w:tcMar>
+              <w:top w:type="dxa" w:w="100"/>
+              <w:left w:type="dxa" w:w="120"/>
+              <w:bottom w:type="dxa" w:w="100"/>
+              <w:right w:type="dxa" w:w="120"/>
+            </w:tcMar>
+          </w:tcPr>
+          <w:p>
+            <w:r>
+              <w:rPr>
+                <w:rFonts w:ascii="Arial" w:cs="Arial" w:eastAsia="Arial" w:hAnsi="Arial"/>
+                <w:b/>
+                <w:bCs/>
+                <w:color w:val="FFFFFF"/>
+                <w:sz w:val="20"/>
+                <w:szCs w:val="20"/>
+              </w:rPr>
+              <w:t xml:space="preserve">Free</w:t>
+            </w:r>
+          </w:p>
+        </w:tc>
+        <w:tc>
+          <w:tcPr>
+            <w:tcW w:type="dxa" w:w="2960"/>
+            <w:tcBorders>
+              <w:top w:val="single" w:color="E5E7EB" w:sz="1"/>
+              <w:left w:val="single" w:color="E5E7EB" w:sz="1"/>
+              <w:bottom w:val="single" w:color="E5E7EB" w:sz="1"/>
+              <w:right w:val="single" w:color="E5E7EB" w:sz="1"/>
+            </w:tcBorders>
+            <w:shd w:fill="1A56DB" w:val="clear"/>
+            <w:tcMar>
+              <w:top w:type="dxa" w:w="100"/>
+              <w:left w:type="dxa" w:w="120"/>
+              <w:bottom w:type="dxa" w:w="100"/>
+              <w:right w:type="dxa" w:w="120"/>
+            </w:tcMar>
+          </w:tcPr>
+          <w:p>
+            <w:r>
+              <w:rPr>
+                <w:rFonts w:ascii="Arial" w:cs="Arial" w:eastAsia="Arial" w:hAnsi="Arial"/>
+                <w:b/>
+                <w:bCs/>
+                <w:color w:val="FFFFFF"/>
+                <w:sz w:val="20"/>
+                <w:szCs w:val="20"/>
+              </w:rPr>
+              <w:t xml:space="preserve">Pro</w:t>
+            </w:r>
+          </w:p>
+        </w:tc>
+      </w:tr>
+      <w:tr>
+        <w:tc>
+          <w:tcPr>
+            <w:tcW w:type="dxa" w:w="4000"/>
+            <w:tcBorders>
+              <w:top w:val="single" w:color="E5E7EB" w:sz="1"/>
+              <w:left w:val="single" w:color="E5E7EB" w:sz="1"/>
+              <w:bottom w:val="single" w:color="E5E7EB" w:sz="1"/>
+              <w:right w:val="single" w:color="E5E7EB" w:sz="1"/>
+            </w:tcBorders>
+            <w:shd w:fill="FFFFFF" w:val="clear"/>
+            <w:tcMar>
+              <w:top w:type="dxa" w:w="80"/>
+              <w:left w:type="dxa" w:w="120"/>
+              <w:bottom w:type="dxa" w:w="80"/>
+              <w:right w:type="dxa" w:w="120"/>
+            </w:tcMar>
+          </w:tcPr>
+          <w:p>
+            <w:r>
+              <w:rPr>
+                <w:rFonts w:ascii="Arial" w:cs="Arial" w:eastAsia="Arial" w:hAnsi="Arial"/>
+                <w:color w:val="111827"/>
+                <w:sz w:val="20"/>
+                <w:szCs w:val="20"/>
+              </w:rPr>
+              <w:t xml:space="preserve">Jumlah turnamen / bulan</w:t>
+            </w:r>
+          </w:p>
+        </w:tc>
+        <w:tc>
+          <w:tcPr>
+            <w:tcW w:type="dxa" w:w="2400"/>
+            <w:tcBorders>
+              <w:top w:val="single" w:color="E5E7EB" w:sz="1"/>
+              <w:left w:val="single" w:color="E5E7EB" w:sz="1"/>
+              <w:bottom w:val="single" w:color="E5E7EB" w:sz="1"/>
+              <w:right w:val="single" w:color="E5E7EB" w:sz="1"/>
+            </w:tcBorders>
+            <w:shd w:fill="FFFFFF" w:val="clear"/>
+            <w:tcMar>
+              <w:top w:type="dxa" w:w="80"/>
+              <w:left w:type="dxa" w:w="120"/>
+              <w:bottom w:type="dxa" w:w="80"/>
+              <w:right w:type="dxa" w:w="120"/>
+            </w:tcMar>
+          </w:tcPr>
+          <w:p>
+            <w:r>
+              <w:rPr>
+                <w:rFonts w:ascii="Arial" w:cs="Arial" w:eastAsia="Arial" w:hAnsi="Arial"/>
+                <w:color w:val="111827"/>
+                <w:sz w:val="20"/>
+                <w:szCs w:val="20"/>
+              </w:rPr>
+              <w:t xml:space="preserve">Maks 5</w:t>
+            </w:r>
+          </w:p>
+        </w:tc>
+        <w:tc>
+          <w:tcPr>
+            <w:tcW w:type="dxa" w:w="2960"/>
+            <w:tcBorders>
+              <w:top w:val="single" w:color="E5E7EB" w:sz="1"/>
+              <w:left w:val="single" w:color="E5E7EB" w:sz="1"/>
+              <w:bottom w:val="single" w:color="E5E7EB" w:sz="1"/>
+              <w:right w:val="single" w:color="E5E7EB" w:sz="1"/>
+            </w:tcBorders>
+            <w:shd w:fill="FFFFFF" w:val="clear"/>
+            <w:tcMar>
+              <w:top w:type="dxa" w:w="80"/>
+              <w:left w:type="dxa" w:w="120"/>
+              <w:bottom w:type="dxa" w:w="80"/>
+              <w:right w:type="dxa" w:w="120"/>
+            </w:tcMar>
+          </w:tcPr>
+          <w:p>
+            <w:r>
+              <w:rPr>
+                <w:rFonts w:ascii="Arial" w:cs="Arial" w:eastAsia="Arial" w:hAnsi="Arial"/>
+                <w:color w:val="111827"/>
+                <w:sz w:val="20"/>
+                <w:szCs w:val="20"/>
+              </w:rPr>
+              <w:t xml:space="preserve">Unlimited</w:t>
+            </w:r>
+          </w:p>
+        </w:tc>
+      </w:tr>
+      <w:tr>
+        <w:tc>
+          <w:tcPr>
+            <w:tcW w:type="dxa" w:w="4000"/>
+            <w:tcBorders>
+              <w:top w:val="single" w:color="E5E7EB" w:sz="1"/>
+              <w:left w:val="single" w:color="E5E7EB" w:sz="1"/>
+              <w:bottom w:val="single" w:color="E5E7EB" w:sz="1"/>
+              <w:right w:val="single" w:color="E5E7EB" w:sz="1"/>
+            </w:tcBorders>
+            <w:shd w:fill="F3F4F6" w:val="clear"/>
+            <w:tcMar>
+              <w:top w:type="dxa" w:w="80"/>
+              <w:left w:type="dxa" w:w="120"/>
+              <w:bottom w:type="dxa" w:w="80"/>
+              <w:right w:type="dxa" w:w="120"/>
+            </w:tcMar>
+          </w:tcPr>
+          <w:p>
+            <w:r>
+              <w:rPr>
+                <w:rFonts w:ascii="Arial" w:cs="Arial" w:eastAsia="Arial" w:hAnsi="Arial"/>
+                <w:color w:val="111827"/>
+                <w:sz w:val="20"/>
+                <w:szCs w:val="20"/>
+              </w:rPr>
+              <w:t xml:space="preserve">Approval turnamen</w:t>
+            </w:r>
+          </w:p>
+        </w:tc>
+        <w:tc>
+          <w:tcPr>
+            <w:tcW w:type="dxa" w:w="2400"/>
+            <w:tcBorders>
+              <w:top w:val="single" w:color="E5E7EB" w:sz="1"/>
+              <w:left w:val="single" w:color="E5E7EB" w:sz="1"/>
+              <w:bottom w:val="single" w:color="E5E7EB" w:sz="1"/>
+              <w:right w:val="single" w:color="E5E7EB" w:sz="1"/>
+            </w:tcBorders>
+            <w:shd w:fill="F3F4F6" w:val="clear"/>
+            <w:tcMar>
+              <w:top w:type="dxa" w:w="80"/>
+              <w:left w:type="dxa" w:w="120"/>
+              <w:bottom w:type="dxa" w:w="80"/>
+              <w:right w:type="dxa" w:w="120"/>
+            </w:tcMar>
+          </w:tcPr>
+          <w:p>
+            <w:r>
+              <w:rPr>
+                <w:rFonts w:ascii="Arial" w:cs="Arial" w:eastAsia="Arial" w:hAnsi="Arial"/>
+                <w:color w:val="111827"/>
+                <w:sz w:val="20"/>
+                <w:szCs w:val="20"/>
+              </w:rPr>
+              <w:t xml:space="preserve">Semi-auto (ada delay)</w:t>
+            </w:r>
+          </w:p>
+        </w:tc>
+        <w:tc>
+          <w:tcPr>
+            <w:tcW w:type="dxa" w:w="2960"/>
+            <w:tcBorders>
+              <w:top w:val="single" w:color="E5E7EB" w:sz="1"/>
+              <w:left w:val="single" w:color="E5E7EB" w:sz="1"/>
+              <w:bottom w:val="single" w:color="E5E7EB" w:sz="1"/>
+              <w:right w:val="single" w:color="E5E7EB" w:sz="1"/>
+            </w:tcBorders>
+            <w:shd w:fill="F3F4F6" w:val="clear"/>
+            <w:tcMar>
+              <w:top w:type="dxa" w:w="80"/>
+              <w:left w:type="dxa" w:w="120"/>
+              <w:bottom w:type="dxa" w:w="80"/>
+              <w:right w:type="dxa" w:w="120"/>
+            </w:tcMar>
+          </w:tcPr>
+          <w:p>
+            <w:r>
+              <w:rPr>
+                <w:rFonts w:ascii="Arial" w:cs="Arial" w:eastAsia="Arial" w:hAnsi="Arial"/>
+                <w:color w:val="111827"/>
+                <w:sz w:val="20"/>
+                <w:szCs w:val="20"/>
+              </w:rPr>
+              <w:t xml:space="preserve">Instan — langsung draft</w:t>
+            </w:r>
+          </w:p>
+        </w:tc>
+      </w:tr>
+      <w:tr>
+        <w:tc>
+          <w:tcPr>
+            <w:tcW w:type="dxa" w:w="4000"/>
+            <w:tcBorders>
+              <w:top w:val="single" w:color="E5E7EB" w:sz="1"/>
+              <w:left w:val="single" w:color="E5E7EB" w:sz="1"/>
+              <w:bottom w:val="single" w:color="E5E7EB" w:sz="1"/>
+              <w:right w:val="single" w:color="E5E7EB" w:sz="1"/>
+            </w:tcBorders>
+            <w:shd w:fill="FFFFFF" w:val="clear"/>
+            <w:tcMar>
+              <w:top w:type="dxa" w:w="80"/>
+              <w:left w:type="dxa" w:w="120"/>
+              <w:bottom w:type="dxa" w:w="80"/>
+              <w:right w:type="dxa" w:w="120"/>
+            </w:tcMar>
+          </w:tcPr>
+          <w:p>
+            <w:r>
+              <w:rPr>
+                <w:rFonts w:ascii="Arial" w:cs="Arial" w:eastAsia="Arial" w:hAnsi="Arial"/>
+                <w:color w:val="111827"/>
+                <w:sz w:val="20"/>
+                <w:szCs w:val="20"/>
+              </w:rPr>
+              <w:t xml:space="preserve">Semua format turnamen</w:t>
+            </w:r>
+          </w:p>
+        </w:tc>
+        <w:tc>
+          <w:tcPr>
+            <w:tcW w:type="dxa" w:w="2400"/>
+            <w:tcBorders>
+              <w:top w:val="single" w:color="E5E7EB" w:sz="1"/>
+              <w:left w:val="single" w:color="E5E7EB" w:sz="1"/>
+              <w:bottom w:val="single" w:color="E5E7EB" w:sz="1"/>
+              <w:right w:val="single" w:color="E5E7EB" w:sz="1"/>
+            </w:tcBorders>
+            <w:shd w:fill="FFFFFF" w:val="clear"/>
+            <w:tcMar>
+              <w:top w:type="dxa" w:w="80"/>
+              <w:left w:type="dxa" w:w="120"/>
+              <w:bottom w:type="dxa" w:w="80"/>
+              <w:right w:type="dxa" w:w="120"/>
+            </w:tcMar>
+          </w:tcPr>
+          <w:p>
+            <w:r>
+              <w:rPr>
+                <w:rFonts w:ascii="Arial" w:cs="Arial" w:eastAsia="Arial" w:hAnsi="Arial"/>
+                <w:color w:val="111827"/>
+                <w:sz w:val="20"/>
+                <w:szCs w:val="20"/>
+              </w:rPr>
+              <w:t xml:space="preserve">Ya</w:t>
+            </w:r>
+          </w:p>
+        </w:tc>
+        <w:tc>
+          <w:tcPr>
+            <w:tcW w:type="dxa" w:w="2960"/>
+            <w:tcBorders>
+              <w:top w:val="single" w:color="E5E7EB" w:sz="1"/>
+              <w:left w:val="single" w:color="E5E7EB" w:sz="1"/>
+              <w:bottom w:val="single" w:color="E5E7EB" w:sz="1"/>
+              <w:right w:val="single" w:color="E5E7EB" w:sz="1"/>
+            </w:tcBorders>
+            <w:shd w:fill="FFFFFF" w:val="clear"/>
+            <w:tcMar>
+              <w:top w:type="dxa" w:w="80"/>
+              <w:left w:type="dxa" w:w="120"/>
+              <w:bottom w:type="dxa" w:w="80"/>
+              <w:right w:type="dxa" w:w="120"/>
+            </w:tcMar>
+          </w:tcPr>
+          <w:p>
+            <w:r>
+              <w:rPr>
+                <w:rFonts w:ascii="Arial" w:cs="Arial" w:eastAsia="Arial" w:hAnsi="Arial"/>
+                <w:color w:val="111827"/>
+                <w:sz w:val="20"/>
+                <w:szCs w:val="20"/>
+              </w:rPr>
+              <w:t xml:space="preserve">Ya</w:t>
+            </w:r>
+          </w:p>
+        </w:tc>
+      </w:tr>
+      <w:tr>
+        <w:tc>
+          <w:tcPr>
+            <w:tcW w:type="dxa" w:w="4000"/>
+            <w:tcBorders>
+              <w:top w:val="single" w:color="E5E7EB" w:sz="1"/>
+              <w:left w:val="single" w:color="E5E7EB" w:sz="1"/>
+              <w:bottom w:val="single" w:color="E5E7EB" w:sz="1"/>
+              <w:right w:val="single" w:color="E5E7EB" w:sz="1"/>
+            </w:tcBorders>
+            <w:shd w:fill="F3F4F6" w:val="clear"/>
+            <w:tcMar>
+              <w:top w:type="dxa" w:w="80"/>
+              <w:left w:type="dxa" w:w="120"/>
+              <w:bottom w:type="dxa" w:w="80"/>
+              <w:right w:type="dxa" w:w="120"/>
+            </w:tcMar>
+          </w:tcPr>
+          <w:p>
+            <w:r>
+              <w:rPr>
+                <w:rFonts w:ascii="Arial" w:cs="Arial" w:eastAsia="Arial" w:hAnsi="Arial"/>
+                <w:color w:val="111827"/>
+                <w:sz w:val="20"/>
+                <w:szCs w:val="20"/>
+              </w:rPr>
+              <w:t xml:space="preserve">Manajemen peserta &amp; tim</w:t>
+            </w:r>
+          </w:p>
+        </w:tc>
+        <w:tc>
+          <w:tcPr>
+            <w:tcW w:type="dxa" w:w="2400"/>
+            <w:tcBorders>
+              <w:top w:val="single" w:color="E5E7EB" w:sz="1"/>
+              <w:left w:val="single" w:color="E5E7EB" w:sz="1"/>
+              <w:bottom w:val="single" w:color="E5E7EB" w:sz="1"/>
+              <w:right w:val="single" w:color="E5E7EB" w:sz="1"/>
+            </w:tcBorders>
+            <w:shd w:fill="F3F4F6" w:val="clear"/>
+            <w:tcMar>
+              <w:top w:type="dxa" w:w="80"/>
+              <w:left w:type="dxa" w:w="120"/>
+              <w:bottom w:type="dxa" w:w="80"/>
+              <w:right w:type="dxa" w:w="120"/>
+            </w:tcMar>
+          </w:tcPr>
+          <w:p>
+            <w:r>
+              <w:rPr>
+                <w:rFonts w:ascii="Arial" w:cs="Arial" w:eastAsia="Arial" w:hAnsi="Arial"/>
+                <w:color w:val="111827"/>
+                <w:sz w:val="20"/>
+                <w:szCs w:val="20"/>
+              </w:rPr>
+              <w:t xml:space="preserve">Ya</w:t>
+            </w:r>
+          </w:p>
+        </w:tc>
+        <w:tc>
+          <w:tcPr>
+            <w:tcW w:type="dxa" w:w="2960"/>
+            <w:tcBorders>
+              <w:top w:val="single" w:color="E5E7EB" w:sz="1"/>
+              <w:left w:val="single" w:color="E5E7EB" w:sz="1"/>
+              <w:bottom w:val="single" w:color="E5E7EB" w:sz="1"/>
+              <w:right w:val="single" w:color="E5E7EB" w:sz="1"/>
+            </w:tcBorders>
+            <w:shd w:fill="F3F4F6" w:val="clear"/>
+            <w:tcMar>
+              <w:top w:type="dxa" w:w="80"/>
+              <w:left w:type="dxa" w:w="120"/>
+              <w:bottom w:type="dxa" w:w="80"/>
+              <w:right w:type="dxa" w:w="120"/>
+            </w:tcMar>
+          </w:tcPr>
+          <w:p>
+            <w:r>
+              <w:rPr>
+                <w:rFonts w:ascii="Arial" w:cs="Arial" w:eastAsia="Arial" w:hAnsi="Arial"/>
+                <w:color w:val="111827"/>
+                <w:sz w:val="20"/>
+                <w:szCs w:val="20"/>
+              </w:rPr>
+              <w:t xml:space="preserve">Ya</w:t>
+            </w:r>
+          </w:p>
+        </w:tc>
+      </w:tr>
+      <w:tr>
+        <w:tc>
+          <w:tcPr>
+            <w:tcW w:type="dxa" w:w="4000"/>
+            <w:tcBorders>
+              <w:top w:val="single" w:color="E5E7EB" w:sz="1"/>
+              <w:left w:val="single" w:color="E5E7EB" w:sz="1"/>
+              <w:bottom w:val="single" w:color="E5E7EB" w:sz="1"/>
+              <w:right w:val="single" w:color="E5E7EB" w:sz="1"/>
+            </w:tcBorders>
+            <w:shd w:fill="FFFFFF" w:val="clear"/>
+            <w:tcMar>
+              <w:top w:type="dxa" w:w="80"/>
+              <w:left w:type="dxa" w:w="120"/>
+              <w:bottom w:type="dxa" w:w="80"/>
+              <w:right w:type="dxa" w:w="120"/>
+            </w:tcMar>
+          </w:tcPr>
+          <w:p>
+            <w:r>
+              <w:rPr>
+                <w:rFonts w:ascii="Arial" w:cs="Arial" w:eastAsia="Arial" w:hAnsi="Arial"/>
+                <w:color w:val="111827"/>
+                <w:sz w:val="20"/>
+                <w:szCs w:val="20"/>
+              </w:rPr>
+              <w:t xml:space="preserve">Public bracket &amp; halaman publik</w:t>
+            </w:r>
+          </w:p>
+        </w:tc>
+        <w:tc>
+          <w:tcPr>
+            <w:tcW w:type="dxa" w:w="2400"/>
+            <w:tcBorders>
+              <w:top w:val="single" w:color="E5E7EB" w:sz="1"/>
+              <w:left w:val="single" w:color="E5E7EB" w:sz="1"/>
+              <w:bottom w:val="single" w:color="E5E7EB" w:sz="1"/>
+              <w:right w:val="single" w:color="E5E7EB" w:sz="1"/>
+            </w:tcBorders>
+            <w:shd w:fill="FFFFFF" w:val="clear"/>
+            <w:tcMar>
+              <w:top w:type="dxa" w:w="80"/>
+              <w:left w:type="dxa" w:w="120"/>
+              <w:bottom w:type="dxa" w:w="80"/>
+              <w:right w:type="dxa" w:w="120"/>
+            </w:tcMar>
+          </w:tcPr>
+          <w:p>
+            <w:r>
+              <w:rPr>
+                <w:rFonts w:ascii="Arial" w:cs="Arial" w:eastAsia="Arial" w:hAnsi="Arial"/>
+                <w:color w:val="111827"/>
+                <w:sz w:val="20"/>
+                <w:szCs w:val="20"/>
+              </w:rPr>
+              <w:t xml:space="preserve">Ya</w:t>
+            </w:r>
+          </w:p>
+        </w:tc>
+        <w:tc>
+          <w:tcPr>
+            <w:tcW w:type="dxa" w:w="2960"/>
+            <w:tcBorders>
+              <w:top w:val="single" w:color="E5E7EB" w:sz="1"/>
+              <w:left w:val="single" w:color="E5E7EB" w:sz="1"/>
+              <w:bottom w:val="single" w:color="E5E7EB" w:sz="1"/>
+              <w:right w:val="single" w:color="E5E7EB" w:sz="1"/>
+            </w:tcBorders>
+            <w:shd w:fill="FFFFFF" w:val="clear"/>
+            <w:tcMar>
+              <w:top w:type="dxa" w:w="80"/>
+              <w:left w:type="dxa" w:w="120"/>
+              <w:bottom w:type="dxa" w:w="80"/>
+              <w:right w:type="dxa" w:w="120"/>
+            </w:tcMar>
+          </w:tcPr>
+          <w:p>
+            <w:r>
+              <w:rPr>
+                <w:rFonts w:ascii="Arial" w:cs="Arial" w:eastAsia="Arial" w:hAnsi="Arial"/>
+                <w:color w:val="111827"/>
+                <w:sz w:val="20"/>
+                <w:szCs w:val="20"/>
+              </w:rPr>
+              <w:t xml:space="preserve">Ya</w:t>
+            </w:r>
+          </w:p>
+        </w:tc>
+      </w:tr>
+      <w:tr>
+        <w:tc>
+          <w:tcPr>
+            <w:tcW w:type="dxa" w:w="4000"/>
+            <w:tcBorders>
+              <w:top w:val="single" w:color="E5E7EB" w:sz="1"/>
+              <w:left w:val="single" w:color="E5E7EB" w:sz="1"/>
+              <w:bottom w:val="single" w:color="E5E7EB" w:sz="1"/>
+              <w:right w:val="single" w:color="E5E7EB" w:sz="1"/>
+            </w:tcBorders>
+            <w:shd w:fill="F3F4F6" w:val="clear"/>
+            <w:tcMar>
+              <w:top w:type="dxa" w:w="80"/>
+              <w:left w:type="dxa" w:w="120"/>
+              <w:bottom w:type="dxa" w:w="80"/>
+              <w:right w:type="dxa" w:w="120"/>
+            </w:tcMar>
+          </w:tcPr>
+          <w:p>
+            <w:r>
+              <w:rPr>
+                <w:rFonts w:ascii="Arial" w:cs="Arial" w:eastAsia="Arial" w:hAnsi="Arial"/>
+                <w:color w:val="111827"/>
+                <w:sz w:val="20"/>
+                <w:szCs w:val="20"/>
+              </w:rPr>
+              <w:t xml:space="preserve">Platform branding di halaman publik</w:t>
+            </w:r>
+          </w:p>
+        </w:tc>
+        <w:tc>
+          <w:tcPr>
+            <w:tcW w:type="dxa" w:w="2400"/>
+            <w:tcBorders>
+              <w:top w:val="single" w:color="E5E7EB" w:sz="1"/>
+              <w:left w:val="single" w:color="E5E7EB" w:sz="1"/>
+              <w:bottom w:val="single" w:color="E5E7EB" w:sz="1"/>
+              <w:right w:val="single" w:color="E5E7EB" w:sz="1"/>
+            </w:tcBorders>
+            <w:shd w:fill="F3F4F6" w:val="clear"/>
+            <w:tcMar>
+              <w:top w:type="dxa" w:w="80"/>
+              <w:left w:type="dxa" w:w="120"/>
+              <w:bottom w:type="dxa" w:w="80"/>
+              <w:right w:type="dxa" w:w="120"/>
+            </w:tcMar>
+          </w:tcPr>
+          <w:p>
+            <w:r>
+              <w:rPr>
+                <w:rFonts w:ascii="Arial" w:cs="Arial" w:eastAsia="Arial" w:hAnsi="Arial"/>
+                <w:color w:val="111827"/>
+                <w:sz w:val="20"/>
+                <w:szCs w:val="20"/>
+              </w:rPr>
+              <w:t xml:space="preserve">Ya (ada logo Juara League)</w:t>
+            </w:r>
+          </w:p>
+        </w:tc>
+        <w:tc>
+          <w:tcPr>
+            <w:tcW w:type="dxa" w:w="2960"/>
+            <w:tcBorders>
+              <w:top w:val="single" w:color="E5E7EB" w:sz="1"/>
+              <w:left w:val="single" w:color="E5E7EB" w:sz="1"/>
+              <w:bottom w:val="single" w:color="E5E7EB" w:sz="1"/>
+              <w:right w:val="single" w:color="E5E7EB" w:sz="1"/>
+            </w:tcBorders>
+            <w:shd w:fill="F3F4F6" w:val="clear"/>
+            <w:tcMar>
+              <w:top w:type="dxa" w:w="80"/>
+              <w:left w:type="dxa" w:w="120"/>
+              <w:bottom w:type="dxa" w:w="80"/>
+              <w:right w:type="dxa" w:w="120"/>
+            </w:tcMar>
+          </w:tcPr>
+          <w:p>
+            <w:r>
+              <w:rPr>
+                <w:rFonts w:ascii="Arial" w:cs="Arial" w:eastAsia="Arial" w:hAnsi="Arial"/>
+                <w:color w:val="111827"/>
+                <w:sz w:val="20"/>
+                <w:szCs w:val="20"/>
+              </w:rPr>
+              <w:t xml:space="preserve">Tidak (bisa custom)</w:t>
+            </w:r>
+          </w:p>
+        </w:tc>
+      </w:tr>
+      <w:tr>
+        <w:tc>
+          <w:tcPr>
+            <w:tcW w:type="dxa" w:w="4000"/>
+            <w:tcBorders>
+              <w:top w:val="single" w:color="E5E7EB" w:sz="1"/>
+              <w:left w:val="single" w:color="E5E7EB" w:sz="1"/>
+              <w:bottom w:val="single" w:color="E5E7EB" w:sz="1"/>
+              <w:right w:val="single" w:color="E5E7EB" w:sz="1"/>
+            </w:tcBorders>
+            <w:shd w:fill="FFFFFF" w:val="clear"/>
+            <w:tcMar>
+              <w:top w:type="dxa" w:w="80"/>
+              <w:left w:type="dxa" w:w="120"/>
+              <w:bottom w:type="dxa" w:w="80"/>
+              <w:right w:type="dxa" w:w="120"/>
+            </w:tcMar>
+          </w:tcPr>
+          <w:p>
+            <w:r>
+              <w:rPr>
+                <w:rFonts w:ascii="Arial" w:cs="Arial" w:eastAsia="Arial" w:hAnsi="Arial"/>
+                <w:color w:val="111827"/>
+                <w:sz w:val="20"/>
+                <w:szCs w:val="20"/>
+              </w:rPr>
+              <w:t xml:space="preserve">Priority support</w:t>
+            </w:r>
+          </w:p>
+        </w:tc>
+        <w:tc>
+          <w:tcPr>
+            <w:tcW w:type="dxa" w:w="2400"/>
+            <w:tcBorders>
+              <w:top w:val="single" w:color="E5E7EB" w:sz="1"/>
+              <w:left w:val="single" w:color="E5E7EB" w:sz="1"/>
+              <w:bottom w:val="single" w:color="E5E7EB" w:sz="1"/>
+              <w:right w:val="single" w:color="E5E7EB" w:sz="1"/>
+            </w:tcBorders>
+            <w:shd w:fill="FFFFFF" w:val="clear"/>
+            <w:tcMar>
+              <w:top w:type="dxa" w:w="80"/>
+              <w:left w:type="dxa" w:w="120"/>
+              <w:bottom w:type="dxa" w:w="80"/>
+              <w:right w:type="dxa" w:w="120"/>
+            </w:tcMar>
+          </w:tcPr>
+          <w:p>
+            <w:r>
+              <w:rPr>
+                <w:rFonts w:ascii="Arial" w:cs="Arial" w:eastAsia="Arial" w:hAnsi="Arial"/>
+                <w:color w:val="111827"/>
+                <w:sz w:val="20"/>
+                <w:szCs w:val="20"/>
+              </w:rPr>
+              <w:t xml:space="preserve">Tidak</w:t>
+            </w:r>
+          </w:p>
+        </w:tc>
+        <w:tc>
+          <w:tcPr>
+            <w:tcW w:type="dxa" w:w="2960"/>
+            <w:tcBorders>
+              <w:top w:val="single" w:color="E5E7EB" w:sz="1"/>
+              <w:left w:val="single" w:color="E5E7EB" w:sz="1"/>
+              <w:bottom w:val="single" w:color="E5E7EB" w:sz="1"/>
+              <w:right w:val="single" w:color="E5E7EB" w:sz="1"/>
+            </w:tcBorders>
+            <w:shd w:fill="FFFFFF" w:val="clear"/>
+            <w:tcMar>
+              <w:top w:type="dxa" w:w="80"/>
+              <w:left w:type="dxa" w:w="120"/>
+              <w:bottom w:type="dxa" w:w="80"/>
+              <w:right w:type="dxa" w:w="120"/>
+            </w:tcMar>
+          </w:tcPr>
+          <w:p>
+            <w:r>
+              <w:rPr>
+                <w:rFonts w:ascii="Arial" w:cs="Arial" w:eastAsia="Arial" w:hAnsi="Arial"/>
+                <w:color w:val="111827"/>
+                <w:sz w:val="20"/>
+                <w:szCs w:val="20"/>
+              </w:rPr>
+              <w:t xml:space="preserve">Ya</w:t>
+            </w:r>
+          </w:p>
+        </w:tc>
+      </w:tr>
+      <w:tr>
+        <w:tc>
+          <w:tcPr>
+            <w:tcW w:type="dxa" w:w="4000"/>
+            <w:tcBorders>
+              <w:top w:val="single" w:color="E5E7EB" w:sz="1"/>
+              <w:left w:val="single" w:color="E5E7EB" w:sz="1"/>
+              <w:bottom w:val="single" w:color="E5E7EB" w:sz="1"/>
+              <w:right w:val="single" w:color="E5E7EB" w:sz="1"/>
+            </w:tcBorders>
+            <w:shd w:fill="F3F4F6" w:val="clear"/>
+            <w:tcMar>
+              <w:top w:type="dxa" w:w="80"/>
+              <w:left w:type="dxa" w:w="120"/>
+              <w:bottom w:type="dxa" w:w="80"/>
+              <w:right w:type="dxa" w:w="120"/>
+            </w:tcMar>
+          </w:tcPr>
+          <w:p>
+            <w:r>
+              <w:rPr>
+                <w:rFonts w:ascii="Arial" w:cs="Arial" w:eastAsia="Arial" w:hAnsi="Arial"/>
+                <w:color w:val="111827"/>
+                <w:sz w:val="20"/>
+                <w:szCs w:val="20"/>
+              </w:rPr>
+              <w:t xml:space="preserve">Analytics dashboard</w:t>
+            </w:r>
+          </w:p>
+        </w:tc>
+        <w:tc>
+          <w:tcPr>
+            <w:tcW w:type="dxa" w:w="2400"/>
+            <w:tcBorders>
+              <w:top w:val="single" w:color="E5E7EB" w:sz="1"/>
+              <w:left w:val="single" w:color="E5E7EB" w:sz="1"/>
+              <w:bottom w:val="single" w:color="E5E7EB" w:sz="1"/>
+              <w:right w:val="single" w:color="E5E7EB" w:sz="1"/>
+            </w:tcBorders>
+            <w:shd w:fill="F3F4F6" w:val="clear"/>
+            <w:tcMar>
+              <w:top w:type="dxa" w:w="80"/>
+              <w:left w:type="dxa" w:w="120"/>
+              <w:bottom w:type="dxa" w:w="80"/>
+              <w:right w:type="dxa" w:w="120"/>
+            </w:tcMar>
+          </w:tcPr>
+          <w:p>
+            <w:r>
+              <w:rPr>
+                <w:rFonts w:ascii="Arial" w:cs="Arial" w:eastAsia="Arial" w:hAnsi="Arial"/>
+                <w:color w:val="111827"/>
+                <w:sz w:val="20"/>
+                <w:szCs w:val="20"/>
+              </w:rPr>
+              <w:t xml:space="preserve">Tidak</w:t>
+            </w:r>
+          </w:p>
+        </w:tc>
+        <w:tc>
+          <w:tcPr>
+            <w:tcW w:type="dxa" w:w="2960"/>
+            <w:tcBorders>
+              <w:top w:val="single" w:color="E5E7EB" w:sz="1"/>
+              <w:left w:val="single" w:color="E5E7EB" w:sz="1"/>
+              <w:bottom w:val="single" w:color="E5E7EB" w:sz="1"/>
+              <w:right w:val="single" w:color="E5E7EB" w:sz="1"/>
+            </w:tcBorders>
+            <w:shd w:fill="F3F4F6" w:val="clear"/>
+            <w:tcMar>
+              <w:top w:type="dxa" w:w="80"/>
+              <w:left w:type="dxa" w:w="120"/>
+              <w:bottom w:type="dxa" w:w="80"/>
+              <w:right w:type="dxa" w:w="120"/>
+            </w:tcMar>
+          </w:tcPr>
+          <w:p>
+            <w:r>
+              <w:rPr>
+                <w:rFonts w:ascii="Arial" w:cs="Arial" w:eastAsia="Arial" w:hAnsi="Arial"/>
+                <w:color w:val="111827"/>
+                <w:sz w:val="20"/>
+                <w:szCs w:val="20"/>
+              </w:rPr>
+              <w:t xml:space="preserve">Ya (V2)</w:t>
+            </w:r>
+          </w:p>
+        </w:tc>
+      </w:tr>
+      <w:tr>
+        <w:tc>
+          <w:tcPr>
+            <w:tcW w:type="dxa" w:w="4000"/>
+            <w:tcBorders>
+              <w:top w:val="single" w:color="E5E7EB" w:sz="1"/>
+              <w:left w:val="single" w:color="E5E7EB" w:sz="1"/>
+              <w:bottom w:val="single" w:color="E5E7EB" w:sz="1"/>
+              <w:right w:val="single" w:color="E5E7EB" w:sz="1"/>
+            </w:tcBorders>
+            <w:shd w:fill="FFFFFF" w:val="clear"/>
+            <w:tcMar>
+              <w:top w:type="dxa" w:w="80"/>
+              <w:left w:type="dxa" w:w="120"/>
+              <w:bottom w:type="dxa" w:w="80"/>
+              <w:right w:type="dxa" w:w="120"/>
+            </w:tcMar>
+          </w:tcPr>
+          <w:p>
+            <w:r>
+              <w:rPr>
+                <w:rFonts w:ascii="Arial" w:cs="Arial" w:eastAsia="Arial" w:hAnsi="Arial"/>
+                <w:color w:val="111827"/>
+                <w:sz w:val="20"/>
+                <w:szCs w:val="20"/>
+              </w:rPr>
+              <w:t xml:space="preserve">Custom domain</w:t>
+            </w:r>
+          </w:p>
+        </w:tc>
+        <w:tc>
+          <w:tcPr>
+            <w:tcW w:type="dxa" w:w="2400"/>
+            <w:tcBorders>
+              <w:top w:val="single" w:color="E5E7EB" w:sz="1"/>
+              <w:left w:val="single" w:color="E5E7EB" w:sz="1"/>
+              <w:bottom w:val="single" w:color="E5E7EB" w:sz="1"/>
+              <w:right w:val="single" w:color="E5E7EB" w:sz="1"/>
+            </w:tcBorders>
+            <w:shd w:fill="FFFFFF" w:val="clear"/>
+            <w:tcMar>
+              <w:top w:type="dxa" w:w="80"/>
+              <w:left w:type="dxa" w:w="120"/>
+              <w:bottom w:type="dxa" w:w="80"/>
+              <w:right w:type="dxa" w:w="120"/>
+            </w:tcMar>
+          </w:tcPr>
+          <w:p>
+            <w:r>
+              <w:rPr>
+                <w:rFonts w:ascii="Arial" w:cs="Arial" w:eastAsia="Arial" w:hAnsi="Arial"/>
+                <w:color w:val="111827"/>
+                <w:sz w:val="20"/>
+                <w:szCs w:val="20"/>
+              </w:rPr>
+              <w:t xml:space="preserve">Tidak</w:t>
+            </w:r>
+          </w:p>
+        </w:tc>
+        <w:tc>
+          <w:tcPr>
+            <w:tcW w:type="dxa" w:w="2960"/>
+            <w:tcBorders>
+              <w:top w:val="single" w:color="E5E7EB" w:sz="1"/>
+              <w:left w:val="single" w:color="E5E7EB" w:sz="1"/>
+              <w:bottom w:val="single" w:color="E5E7EB" w:sz="1"/>
+              <w:right w:val="single" w:color="E5E7EB" w:sz="1"/>
+            </w:tcBorders>
+            <w:shd w:fill="FFFFFF" w:val="clear"/>
+            <w:tcMar>
+              <w:top w:type="dxa" w:w="80"/>
+              <w:left w:type="dxa" w:w="120"/>
+              <w:bottom w:type="dxa" w:w="80"/>
+              <w:right w:type="dxa" w:w="120"/>
+            </w:tcMar>
+          </w:tcPr>
+          <w:p>
+            <w:r>
+              <w:rPr>
+                <w:rFonts w:ascii="Arial" w:cs="Arial" w:eastAsia="Arial" w:hAnsi="Arial"/>
+                <w:color w:val="111827"/>
+                <w:sz w:val="20"/>
+                <w:szCs w:val="20"/>
+              </w:rPr>
+              <w:t xml:space="preserve">Ya (V2)</w:t>
+            </w:r>
+          </w:p>
+        </w:tc>
+      </w:tr>
+      <w:tr>
+        <w:tc>
+          <w:tcPr>
+            <w:tcW w:type="dxa" w:w="4000"/>
+            <w:tcBorders>
+              <w:top w:val="single" w:color="E5E7EB" w:sz="1"/>
+              <w:left w:val="single" w:color="E5E7EB" w:sz="1"/>
+              <w:bottom w:val="single" w:color="E5E7EB" w:sz="1"/>
+              <w:right w:val="single" w:color="E5E7EB" w:sz="1"/>
+            </w:tcBorders>
+            <w:shd w:fill="F3F4F6" w:val="clear"/>
+            <w:tcMar>
+              <w:top w:type="dxa" w:w="80"/>
+              <w:left w:type="dxa" w:w="120"/>
+              <w:bottom w:type="dxa" w:w="80"/>
+              <w:right w:type="dxa" w:w="120"/>
+            </w:tcMar>
+          </w:tcPr>
+          <w:p>
+            <w:r>
+              <w:rPr>
+                <w:rFonts w:ascii="Arial" w:cs="Arial" w:eastAsia="Arial" w:hAnsi="Arial"/>
+                <w:color w:val="111827"/>
+                <w:sz w:val="20"/>
+                <w:szCs w:val="20"/>
+              </w:rPr>
+              <w:t xml:space="preserve">White-label</w:t>
+            </w:r>
+          </w:p>
+        </w:tc>
+        <w:tc>
+          <w:tcPr>
+            <w:tcW w:type="dxa" w:w="2400"/>
+            <w:tcBorders>
+              <w:top w:val="single" w:color="E5E7EB" w:sz="1"/>
+              <w:left w:val="single" w:color="E5E7EB" w:sz="1"/>
+              <w:bottom w:val="single" w:color="E5E7EB" w:sz="1"/>
+              <w:right w:val="single" w:color="E5E7EB" w:sz="1"/>
+            </w:tcBorders>
+            <w:shd w:fill="F3F4F6" w:val="clear"/>
+            <w:tcMar>
+              <w:top w:type="dxa" w:w="80"/>
+              <w:left w:type="dxa" w:w="120"/>
+              <w:bottom w:type="dxa" w:w="80"/>
+              <w:right w:type="dxa" w:w="120"/>
+            </w:tcMar>
+          </w:tcPr>
+          <w:p>
+            <w:r>
+              <w:rPr>
+                <w:rFonts w:ascii="Arial" w:cs="Arial" w:eastAsia="Arial" w:hAnsi="Arial"/>
+                <w:color w:val="111827"/>
+                <w:sz w:val="20"/>
+                <w:szCs w:val="20"/>
+              </w:rPr>
+              <w:t xml:space="preserve">Tidak</w:t>
+            </w:r>
+          </w:p>
+        </w:tc>
+        <w:tc>
+          <w:tcPr>
+            <w:tcW w:type="dxa" w:w="2960"/>
+            <w:tcBorders>
+              <w:top w:val="single" w:color="E5E7EB" w:sz="1"/>
+              <w:left w:val="single" w:color="E5E7EB" w:sz="1"/>
+              <w:bottom w:val="single" w:color="E5E7EB" w:sz="1"/>
+              <w:right w:val="single" w:color="E5E7EB" w:sz="1"/>
+            </w:tcBorders>
+            <w:shd w:fill="F3F4F6" w:val="clear"/>
+            <w:tcMar>
+              <w:top w:type="dxa" w:w="80"/>
+              <w:left w:type="dxa" w:w="120"/>
+              <w:bottom w:type="dxa" w:w="80"/>
+              <w:right w:type="dxa" w:w="120"/>
+            </w:tcMar>
+          </w:tcPr>
+          <w:p>
+            <w:r>
+              <w:rPr>
+                <w:rFonts w:ascii="Arial" w:cs="Arial" w:eastAsia="Arial" w:hAnsi="Arial"/>
+                <w:color w:val="111827"/>
+                <w:sz w:val="20"/>
+                <w:szCs w:val="20"/>
+              </w:rPr>
+              <w:t xml:space="preserve">Ya (V2)</w:t>
+            </w:r>
+          </w:p>
+        </w:tc>
+      </w:tr>
+    </w:tbl>
+    <w:p>
+      <w:pPr>
+        <w:spacing w:before="0" w:after="0"/>
+      </w:pPr>
+      <w:r>
+        <w:rPr>
+          <w:rFonts w:ascii="Arial" w:cs="Arial" w:eastAsia="Arial" w:hAnsi="Arial"/>
+          <w:sz w:val="22"/>
+          <w:szCs w:val="22"/>
+        </w:rPr>
+        <w:t xml:space="preserve"/>
+      </w:r>
+    </w:p>
+    <w:p>
+      <w:pPr>
+        <w:pStyle w:val="Heading2"/>
+        <w:spacing w:before="320" w:after="160"/>
+      </w:pPr>
+      <w:r>
+        <w:rPr>
+          <w:rFonts w:ascii="Arial" w:cs="Arial" w:eastAsia="Arial" w:hAnsi="Arial"/>
+          <w:b/>
+          <w:bCs/>
+          <w:color w:val="111827"/>
+          <w:sz w:val="26"/>
+          <w:szCs w:val="26"/>
+        </w:rPr>
+        <w:t xml:space="preserve">7.2 Model Subscription Pro</w:t>
+      </w:r>
+    </w:p>
+    <w:p>
+      <w:pPr>
+        <w:pStyle w:val="ListParagraph"/>
+        <w:numPr>
+          <w:ilvl w:val="0"/>
+          <w:numId w:val="2"/>
+        </w:numPr>
+        <w:spacing w:before="60" w:after="60"/>
+      </w:pPr>
+      <w:r>
+        <w:rPr>
+          <w:rFonts w:ascii="Arial" w:cs="Arial" w:eastAsia="Arial" w:hAnsi="Arial"/>
+          <w:color w:val="111827"/>
+          <w:sz w:val="22"/>
+          <w:szCs w:val="22"/>
+        </w:rPr>
+        <w:t xml:space="preserve">Subscription per organizer — user membayar untuk akun Pro mereka</w:t>
+      </w:r>
+    </w:p>
+    <w:p>
+      <w:pPr>
+        <w:pStyle w:val="ListParagraph"/>
+        <w:numPr>
+          <w:ilvl w:val="0"/>
+          <w:numId w:val="2"/>
+        </w:numPr>
+        <w:spacing w:before="60" w:after="60"/>
+      </w:pPr>
+      <w:r>
+        <w:rPr>
+          <w:rFonts w:ascii="Arial" w:cs="Arial" w:eastAsia="Arial" w:hAnsi="Arial"/>
+          <w:color w:val="111827"/>
+          <w:sz w:val="22"/>
+          <w:szCs w:val="22"/>
+        </w:rPr>
+        <w:t xml:space="preserve">Tersedia pilihan billing bulanan dan tahunan</w:t>
+      </w:r>
+    </w:p>
+    <w:p>
+      <w:pPr>
+        <w:pStyle w:val="ListParagraph"/>
+        <w:numPr>
+          <w:ilvl w:val="0"/>
+          <w:numId w:val="2"/>
+        </w:numPr>
+        <w:spacing w:before="60" w:after="60"/>
+      </w:pPr>
+      <w:r>
+        <w:rPr>
+          <w:rFonts w:ascii="Arial" w:cs="Arial" w:eastAsia="Arial" w:hAnsi="Arial"/>
+          <w:color w:val="111827"/>
+          <w:sz w:val="22"/>
+          <w:szCs w:val="22"/>
+        </w:rPr>
+        <w:t xml:space="preserve">Billing tahunan mendapatkan diskon dibanding akumulasi bulanan</w:t>
+      </w:r>
+    </w:p>
+    <w:p>
+      <w:pPr>
+        <w:pStyle w:val="ListParagraph"/>
+        <w:numPr>
+          <w:ilvl w:val="0"/>
+          <w:numId w:val="2"/>
+        </w:numPr>
+        <w:spacing w:before="60" w:after="60"/>
+      </w:pPr>
+      <w:r>
+        <w:rPr>
+          <w:rFonts w:ascii="Arial" w:cs="Arial" w:eastAsia="Arial" w:hAnsi="Arial"/>
+          <w:color w:val="111827"/>
+          <w:sz w:val="22"/>
+          <w:szCs w:val="22"/>
+        </w:rPr>
+        <w:t xml:space="preserve">Jika subscription expired, akun otomatis kembali ke Free tier</w:t>
+      </w:r>
+    </w:p>
+    <w:p>
+      <w:pPr>
+        <w:pStyle w:val="ListParagraph"/>
+        <w:numPr>
+          <w:ilvl w:val="0"/>
+          <w:numId w:val="2"/>
+        </w:numPr>
+        <w:spacing w:before="60" w:after="60"/>
+      </w:pPr>
+      <w:r>
+        <w:rPr>
+          <w:rFonts w:ascii="Arial" w:cs="Arial" w:eastAsia="Arial" w:hAnsi="Arial"/>
+          <w:color w:val="111827"/>
+          <w:sz w:val="22"/>
+          <w:szCs w:val="22"/>
+        </w:rPr>
+        <w:t xml:space="preserve">Turnamen yang sudah dibuat tetap aktif meski subscription expired</w:t>
+      </w:r>
+    </w:p>
+    <w:p>
+      <w:pPr>
+        <w:spacing w:before="0" w:after="0"/>
+      </w:pPr>
+      <w:r>
+        <w:rPr>
+          <w:rFonts w:ascii="Arial" w:cs="Arial" w:eastAsia="Arial" w:hAnsi="Arial"/>
+          <w:sz w:val="22"/>
+          <w:szCs w:val="22"/>
+        </w:rPr>
+        <w:t xml:space="preserve"/>
+      </w:r>
+    </w:p>
+    <w:p>
+      <w:pPr>
+        <w:pStyle w:val="Heading2"/>
+        <w:spacing w:before="320" w:after="160"/>
+      </w:pPr>
+      <w:r>
+        <w:rPr>
+          <w:rFonts w:ascii="Arial" w:cs="Arial" w:eastAsia="Arial" w:hAnsi="Arial"/>
+          <w:b/>
+          <w:bCs/>
+          <w:color w:val="111827"/>
+          <w:sz w:val="26"/>
+          <w:szCs w:val="26"/>
+        </w:rPr>
+        <w:t xml:space="preserve">7.3 Sistem Approval Turnamen (Free Tier)</w:t>
+      </w:r>
+    </w:p>
+    <w:p>
+      <w:pPr>
+        <w:spacing w:before="80" w:after="80"/>
+      </w:pPr>
+      <w:r>
+        <w:rPr>
+          <w:rFonts w:ascii="Arial" w:cs="Arial" w:eastAsia="Arial" w:hAnsi="Arial"/>
+          <w:color w:val="111827"/>
+          <w:sz w:val="22"/>
+          <w:szCs w:val="22"/>
+        </w:rPr>
+        <w:t xml:space="preserve">Untuk menjaga kualitas konten platform dan mencegah abuse, setiap turnamen yang dibuat oleh Free user melalui proses semi-automatic approval sebelum dapat dipublikasikan.</w:t>
+      </w:r>
+    </w:p>
+    <w:p>
+      <w:pPr>
+        <w:spacing w:before="0" w:after="0"/>
+      </w:pPr>
+      <w:r>
+        <w:rPr>
+          <w:rFonts w:ascii="Arial" w:cs="Arial" w:eastAsia="Arial" w:hAnsi="Arial"/>
+          <w:sz w:val="22"/>
+          <w:szCs w:val="22"/>
+        </w:rPr>
+        <w:t xml:space="preserve"/>
+      </w:r>
+    </w:p>
+    <w:tbl>
+      <w:tblPr>
+        <w:tblW w:type="dxa" w:w="9360"/>
+        <w:tblBorders>
+          <w:top w:val="single" w:color="auto" w:sz="4"/>
+          <w:left w:val="single" w:color="auto" w:sz="4"/>
+          <w:bottom w:val="single" w:color="auto" w:sz="4"/>
+          <w:right w:val="single" w:color="auto" w:sz="4"/>
+          <w:insideH w:val="single" w:color="auto" w:sz="4"/>
+          <w:insideV w:val="single" w:color="auto" w:sz="4"/>
+        </w:tblBorders>
+      </w:tblPr>
+      <w:tblGrid>
+        <w:gridCol w:w="9360"/>
+      </w:tblGrid>
+      <w:tr>
+        <w:tc>
+          <w:tcPr>
+            <w:tcW w:type="dxa" w:w="9360"/>
+            <w:tcBorders>
+              <w:top w:val="single" w:color="E5E7EB" w:sz="1"/>
+              <w:left w:val="single" w:color="E5E7EB" w:sz="1"/>
+              <w:bottom w:val="single" w:color="E5E7EB" w:sz="1"/>
+              <w:right w:val="single" w:color="E5E7EB" w:sz="1"/>
+            </w:tcBorders>
+            <w:shd w:fill="1A56DB" w:val="clear"/>
+            <w:tcMar>
+              <w:top w:type="dxa" w:w="100"/>
+              <w:left w:type="dxa" w:w="160"/>
+              <w:bottom w:type="dxa" w:w="100"/>
+              <w:right w:type="dxa" w:w="160"/>
+            </w:tcMar>
+          </w:tcPr>
+          <w:p>
+            <w:r>
+              <w:rPr>
+                <w:rFonts w:ascii="Arial" w:cs="Arial" w:eastAsia="Arial" w:hAnsi="Arial"/>
+                <w:b/>
+                <w:bCs/>
+                <w:color w:val="FFFFFF"/>
+                <w:sz w:val="22"/>
+                <w:szCs w:val="22"/>
+              </w:rPr>
+              <w:t xml:space="preserve">Kriteria Auto-Approve (Free Tier)</w:t>
+            </w:r>
+          </w:p>
+        </w:tc>
+      </w:tr>
+      <w:tr>
+        <w:tc>
+          <w:tcPr>
+            <w:tcW w:type="dxa" w:w="9360"/>
+            <w:tcBorders>
+              <w:top w:val="single" w:color="E5E7EB" w:sz="1"/>
+              <w:left w:val="single" w:color="E5E7EB" w:sz="1"/>
+              <w:bottom w:val="single" w:color="E5E7EB" w:sz="1"/>
+              <w:right w:val="single" w:color="E5E7EB" w:sz="1"/>
+            </w:tcBorders>
+            <w:shd w:fill="EBF2FF" w:val="clear"/>
+            <w:tcMar>
+              <w:top w:type="dxa" w:w="80"/>
+              <w:left w:type="dxa" w:w="160"/>
+              <w:bottom w:type="dxa" w:w="80"/>
+              <w:right w:type="dxa" w:w="160"/>
+            </w:tcMar>
+          </w:tcPr>
+          <w:p>
+            <w:r>
+              <w:rPr>
+                <w:rFonts w:ascii="Arial" w:cs="Arial" w:eastAsia="Arial" w:hAnsi="Arial"/>
+                <w:color w:val="111827"/>
+                <w:sz w:val="20"/>
+                <w:szCs w:val="20"/>
+              </w:rPr>
+              <w:t xml:space="preserve">Email organizer sudah diverifikasi</w:t>
+            </w:r>
+          </w:p>
+        </w:tc>
+      </w:tr>
+      <w:tr>
+        <w:tc>
+          <w:tcPr>
+            <w:tcW w:type="dxa" w:w="9360"/>
+            <w:tcBorders>
+              <w:top w:val="single" w:color="E5E7EB" w:sz="1"/>
+              <w:left w:val="single" w:color="E5E7EB" w:sz="1"/>
+              <w:bottom w:val="single" w:color="E5E7EB" w:sz="1"/>
+              <w:right w:val="single" w:color="E5E7EB" w:sz="1"/>
+            </w:tcBorders>
+            <w:shd w:fill="FFFFFF" w:val="clear"/>
+            <w:tcMar>
+              <w:top w:type="dxa" w:w="80"/>
+              <w:left w:type="dxa" w:w="160"/>
+              <w:bottom w:type="dxa" w:w="80"/>
+              <w:right w:type="dxa" w:w="160"/>
+            </w:tcMar>
+          </w:tcPr>
+          <w:p>
+            <w:r>
+              <w:rPr>
+                <w:rFonts w:ascii="Arial" w:cs="Arial" w:eastAsia="Arial" w:hAnsi="Arial"/>
+                <w:color w:val="111827"/>
+                <w:sz w:val="20"/>
+                <w:szCs w:val="20"/>
+              </w:rPr>
+              <w:t xml:space="preserve">Akun berumur lebih dari 7 hari sejak registrasi</w:t>
+            </w:r>
+          </w:p>
+        </w:tc>
+      </w:tr>
+      <w:tr>
+        <w:tc>
+          <w:tcPr>
+            <w:tcW w:type="dxa" w:w="9360"/>
+            <w:tcBorders>
+              <w:top w:val="single" w:color="E5E7EB" w:sz="1"/>
+              <w:left w:val="single" w:color="E5E7EB" w:sz="1"/>
+              <w:bottom w:val="single" w:color="E5E7EB" w:sz="1"/>
+              <w:right w:val="single" w:color="E5E7EB" w:sz="1"/>
+            </w:tcBorders>
+            <w:shd w:fill="EBF2FF" w:val="clear"/>
+            <w:tcMar>
+              <w:top w:type="dxa" w:w="80"/>
+              <w:left w:type="dxa" w:w="160"/>
+              <w:bottom w:type="dxa" w:w="80"/>
+              <w:right w:type="dxa" w:w="160"/>
+            </w:tcMar>
+          </w:tcPr>
+          <w:p>
+            <w:r>
+              <w:rPr>
+                <w:rFonts w:ascii="Arial" w:cs="Arial" w:eastAsia="Arial" w:hAnsi="Arial"/>
+                <w:color w:val="111827"/>
+                <w:sz w:val="20"/>
+                <w:szCs w:val="20"/>
+              </w:rPr>
+              <w:t xml:space="preserve">Nama turnamen tidak mengandung kata terlarang</w:t>
+            </w:r>
+          </w:p>
+        </w:tc>
+      </w:tr>
+      <w:tr>
+        <w:tc>
+          <w:tcPr>
+            <w:tcW w:type="dxa" w:w="9360"/>
+            <w:tcBorders>
+              <w:top w:val="single" w:color="E5E7EB" w:sz="1"/>
+              <w:left w:val="single" w:color="E5E7EB" w:sz="1"/>
+              <w:bottom w:val="single" w:color="E5E7EB" w:sz="1"/>
+              <w:right w:val="single" w:color="E5E7EB" w:sz="1"/>
+            </w:tcBorders>
+            <w:shd w:fill="FFFFFF" w:val="clear"/>
+            <w:tcMar>
+              <w:top w:type="dxa" w:w="80"/>
+              <w:left w:type="dxa" w:w="160"/>
+              <w:bottom w:type="dxa" w:w="80"/>
+              <w:right w:type="dxa" w:w="160"/>
+            </w:tcMar>
+          </w:tcPr>
+          <w:p>
+            <w:r>
+              <w:rPr>
+                <w:rFonts w:ascii="Arial" w:cs="Arial" w:eastAsia="Arial" w:hAnsi="Arial"/>
+                <w:color w:val="111827"/>
+                <w:sz w:val="20"/>
+                <w:szCs w:val="20"/>
+              </w:rPr>
+              <w:t xml:space="preserve">Akun tidak sedang dalam status suspend atau warning</w:t>
+            </w:r>
+          </w:p>
+        </w:tc>
+      </w:tr>
+      <w:tr>
+        <w:tc>
+          <w:tcPr>
+            <w:tcW w:type="dxa" w:w="9360"/>
+            <w:tcBorders>
+              <w:top w:val="single" w:color="E5E7EB" w:sz="1"/>
+              <w:left w:val="single" w:color="E5E7EB" w:sz="1"/>
+              <w:bottom w:val="single" w:color="E5E7EB" w:sz="1"/>
+              <w:right w:val="single" w:color="E5E7EB" w:sz="1"/>
+            </w:tcBorders>
+            <w:shd w:fill="EBF2FF" w:val="clear"/>
+            <w:tcMar>
+              <w:top w:type="dxa" w:w="80"/>
+              <w:left w:type="dxa" w:w="160"/>
+              <w:bottom w:type="dxa" w:w="80"/>
+              <w:right w:type="dxa" w:w="160"/>
+            </w:tcMar>
+          </w:tcPr>
+          <w:p>
+            <w:r>
+              <w:rPr>
+                <w:rFonts w:ascii="Arial" w:cs="Arial" w:eastAsia="Arial" w:hAnsi="Arial"/>
+                <w:color w:val="111827"/>
+                <w:sz w:val="20"/>
+                <w:szCs w:val="20"/>
+              </w:rPr>
+              <w:t xml:space="preserve">Kuota bulanan belum habis (&lt; 5 turnamen bulan ini)</w:t>
+            </w:r>
+          </w:p>
+        </w:tc>
+      </w:tr>
+    </w:tbl>
+    <w:p>
+      <w:pPr>
+        <w:spacing w:before="0" w:after="0"/>
+      </w:pPr>
+      <w:r>
+        <w:rPr>
+          <w:rFonts w:ascii="Arial" w:cs="Arial" w:eastAsia="Arial" w:hAnsi="Arial"/>
+          <w:sz w:val="22"/>
+          <w:szCs w:val="22"/>
+        </w:rPr>
+        <w:t xml:space="preserve"/>
+      </w:r>
+    </w:p>
+    <w:p>
+      <w:pPr>
+        <w:spacing w:before="80" w:after="80"/>
+      </w:pPr>
+      <w:r>
+        <w:rPr>
+          <w:rFonts w:ascii="Arial" w:cs="Arial" w:eastAsia="Arial" w:hAnsi="Arial"/>
+          <w:color w:val="111827"/>
+          <w:sz w:val="22"/>
+          <w:szCs w:val="22"/>
+        </w:rPr>
+        <w:t xml:space="preserve">Jika semua kriteria terpenuhi, turnamen otomatis disetujui dan langsung berstatus draft. Jika ada kriteria yang tidak terpenuhi, turnamen masuk antrian review manual oleh tim platform.</w:t>
+      </w:r>
+    </w:p>
+    <w:p>
+      <w:pPr>
+        <w:spacing w:before="0" w:after="0"/>
+      </w:pPr>
+      <w:r>
+        <w:rPr>
+          <w:rFonts w:ascii="Arial" w:cs="Arial" w:eastAsia="Arial" w:hAnsi="Arial"/>
+          <w:sz w:val="22"/>
+          <w:szCs w:val="22"/>
+        </w:rPr>
+        <w:t xml:space="preserve"/>
+      </w:r>
+    </w:p>
+    <w:tbl>
+      <w:tblPr>
+        <w:tblW w:type="dxa" w:w="9360"/>
+        <w:tblBorders>
+          <w:top w:val="single" w:color="auto" w:sz="4"/>
+          <w:left w:val="single" w:color="auto" w:sz="4"/>
+          <w:bottom w:val="single" w:color="auto" w:sz="4"/>
+          <w:right w:val="single" w:color="auto" w:sz="4"/>
+          <w:insideH w:val="single" w:color="auto" w:sz="4"/>
+          <w:insideV w:val="single" w:color="auto" w:sz="4"/>
+        </w:tblBorders>
+      </w:tblPr>
+      <w:tblGrid>
+        <w:gridCol w:w="2000"/>
+        <w:gridCol w:w="3500"/>
+        <w:gridCol w:w="3860"/>
+      </w:tblGrid>
+      <w:tr>
+        <w:trPr>
+          <w:tblHeader/>
+        </w:trPr>
+        <w:tc>
+          <w:tcPr>
+            <w:tcW w:type="dxa" w:w="2000"/>
+            <w:tcBorders>
+              <w:top w:val="single" w:color="E5E7EB" w:sz="1"/>
+              <w:left w:val="single" w:color="E5E7EB" w:sz="1"/>
+              <w:bottom w:val="single" w:color="E5E7EB" w:sz="1"/>
+              <w:right w:val="single" w:color="E5E7EB" w:sz="1"/>
+            </w:tcBorders>
+            <w:shd w:fill="1A56DB" w:val="clear"/>
+            <w:tcMar>
+              <w:top w:type="dxa" w:w="100"/>
+              <w:left w:type="dxa" w:w="120"/>
+              <w:bottom w:type="dxa" w:w="100"/>
+              <w:right w:type="dxa" w:w="120"/>
+            </w:tcMar>
+          </w:tcPr>
+          <w:p>
+            <w:r>
+              <w:rPr>
+                <w:rFonts w:ascii="Arial" w:cs="Arial" w:eastAsia="Arial" w:hAnsi="Arial"/>
+                <w:b/>
+                <w:bCs/>
+                <w:color w:val="FFFFFF"/>
+                <w:sz w:val="20"/>
+                <w:szCs w:val="20"/>
+              </w:rPr>
+              <w:t xml:space="preserve">Status Approval</w:t>
+            </w:r>
+          </w:p>
+        </w:tc>
+        <w:tc>
+          <w:tcPr>
+            <w:tcW w:type="dxa" w:w="3500"/>
+            <w:tcBorders>
+              <w:top w:val="single" w:color="E5E7EB" w:sz="1"/>
+              <w:left w:val="single" w:color="E5E7EB" w:sz="1"/>
+              <w:bottom w:val="single" w:color="E5E7EB" w:sz="1"/>
+              <w:right w:val="single" w:color="E5E7EB" w:sz="1"/>
+            </w:tcBorders>
+            <w:shd w:fill="1A56DB" w:val="clear"/>
+            <w:tcMar>
+              <w:top w:type="dxa" w:w="100"/>
+              <w:left w:type="dxa" w:w="120"/>
+              <w:bottom w:type="dxa" w:w="100"/>
+              <w:right w:type="dxa" w:w="120"/>
+            </w:tcMar>
+          </w:tcPr>
+          <w:p>
+            <w:r>
+              <w:rPr>
+                <w:rFonts w:ascii="Arial" w:cs="Arial" w:eastAsia="Arial" w:hAnsi="Arial"/>
+                <w:b/>
+                <w:bCs/>
+                <w:color w:val="FFFFFF"/>
+                <w:sz w:val="20"/>
+                <w:szCs w:val="20"/>
+              </w:rPr>
+              <w:t xml:space="preserve">Kondisi</w:t>
+            </w:r>
+          </w:p>
+        </w:tc>
+        <w:tc>
+          <w:tcPr>
+            <w:tcW w:type="dxa" w:w="3860"/>
+            <w:tcBorders>
+              <w:top w:val="single" w:color="E5E7EB" w:sz="1"/>
+              <w:left w:val="single" w:color="E5E7EB" w:sz="1"/>
+              <w:bottom w:val="single" w:color="E5E7EB" w:sz="1"/>
+              <w:right w:val="single" w:color="E5E7EB" w:sz="1"/>
+            </w:tcBorders>
+            <w:shd w:fill="1A56DB" w:val="clear"/>
+            <w:tcMar>
+              <w:top w:type="dxa" w:w="100"/>
+              <w:left w:type="dxa" w:w="120"/>
+              <w:bottom w:type="dxa" w:w="100"/>
+              <w:right w:type="dxa" w:w="120"/>
+            </w:tcMar>
+          </w:tcPr>
+          <w:p>
+            <w:r>
+              <w:rPr>
+                <w:rFonts w:ascii="Arial" w:cs="Arial" w:eastAsia="Arial" w:hAnsi="Arial"/>
+                <w:b/>
+                <w:bCs/>
+                <w:color w:val="FFFFFF"/>
+                <w:sz w:val="20"/>
+                <w:szCs w:val="20"/>
+              </w:rPr>
+              <w:t xml:space="preserve">Aksi Selanjutnya</w:t>
+            </w:r>
+          </w:p>
+        </w:tc>
+      </w:tr>
+      <w:tr>
+        <w:tc>
+          <w:tcPr>
+            <w:tcW w:type="dxa" w:w="2000"/>
+            <w:tcBorders>
+              <w:top w:val="single" w:color="E5E7EB" w:sz="1"/>
+              <w:left w:val="single" w:color="E5E7EB" w:sz="1"/>
+              <w:bottom w:val="single" w:color="E5E7EB" w:sz="1"/>
+              <w:right w:val="single" w:color="E5E7EB" w:sz="1"/>
+            </w:tcBorders>
+            <w:shd w:fill="FFFFFF" w:val="clear"/>
+            <w:tcMar>
+              <w:top w:type="dxa" w:w="80"/>
+              <w:left w:type="dxa" w:w="120"/>
+              <w:bottom w:type="dxa" w:w="80"/>
+              <w:right w:type="dxa" w:w="120"/>
+            </w:tcMar>
+          </w:tcPr>
+          <w:p>
+            <w:r>
+              <w:rPr>
+                <w:rFonts w:ascii="Arial" w:cs="Arial" w:eastAsia="Arial" w:hAnsi="Arial"/>
+                <w:color w:val="111827"/>
+                <w:sz w:val="20"/>
+                <w:szCs w:val="20"/>
+              </w:rPr>
+              <w:t xml:space="preserve">auto_approved</w:t>
+            </w:r>
+          </w:p>
+        </w:tc>
+        <w:tc>
+          <w:tcPr>
+            <w:tcW w:type="dxa" w:w="3500"/>
+            <w:tcBorders>
+              <w:top w:val="single" w:color="E5E7EB" w:sz="1"/>
+              <w:left w:val="single" w:color="E5E7EB" w:sz="1"/>
+              <w:bottom w:val="single" w:color="E5E7EB" w:sz="1"/>
+              <w:right w:val="single" w:color="E5E7EB" w:sz="1"/>
+            </w:tcBorders>
+            <w:shd w:fill="FFFFFF" w:val="clear"/>
+            <w:tcMar>
+              <w:top w:type="dxa" w:w="80"/>
+              <w:left w:type="dxa" w:w="120"/>
+              <w:bottom w:type="dxa" w:w="80"/>
+              <w:right w:type="dxa" w:w="120"/>
+            </w:tcMar>
+          </w:tcPr>
+          <w:p>
+            <w:r>
+              <w:rPr>
+                <w:rFonts w:ascii="Arial" w:cs="Arial" w:eastAsia="Arial" w:hAnsi="Arial"/>
+                <w:color w:val="111827"/>
+                <w:sz w:val="20"/>
+                <w:szCs w:val="20"/>
+              </w:rPr>
+              <w:t xml:space="preserve">Semua kriteria auto-approve terpenuhi</w:t>
+            </w:r>
+          </w:p>
+        </w:tc>
+        <w:tc>
+          <w:tcPr>
+            <w:tcW w:type="dxa" w:w="3860"/>
+            <w:tcBorders>
+              <w:top w:val="single" w:color="E5E7EB" w:sz="1"/>
+              <w:left w:val="single" w:color="E5E7EB" w:sz="1"/>
+              <w:bottom w:val="single" w:color="E5E7EB" w:sz="1"/>
+              <w:right w:val="single" w:color="E5E7EB" w:sz="1"/>
+            </w:tcBorders>
+            <w:shd w:fill="FFFFFF" w:val="clear"/>
+            <w:tcMar>
+              <w:top w:type="dxa" w:w="80"/>
+              <w:left w:type="dxa" w:w="120"/>
+              <w:bottom w:type="dxa" w:w="80"/>
+              <w:right w:type="dxa" w:w="120"/>
+            </w:tcMar>
+          </w:tcPr>
+          <w:p>
+            <w:r>
+              <w:rPr>
+                <w:rFonts w:ascii="Arial" w:cs="Arial" w:eastAsia="Arial" w:hAnsi="Arial"/>
+                <w:color w:val="111827"/>
+                <w:sz w:val="20"/>
+                <w:szCs w:val="20"/>
+              </w:rPr>
+              <w:t xml:space="preserve">Langsung berstatus draft, organizer bisa lanjut konfigurasi</w:t>
+            </w:r>
+          </w:p>
+        </w:tc>
+      </w:tr>
+      <w:tr>
+        <w:tc>
+          <w:tcPr>
+            <w:tcW w:type="dxa" w:w="2000"/>
+            <w:tcBorders>
+              <w:top w:val="single" w:color="E5E7EB" w:sz="1"/>
+              <w:left w:val="single" w:color="E5E7EB" w:sz="1"/>
+              <w:bottom w:val="single" w:color="E5E7EB" w:sz="1"/>
+              <w:right w:val="single" w:color="E5E7EB" w:sz="1"/>
+            </w:tcBorders>
+            <w:shd w:fill="F3F4F6" w:val="clear"/>
+            <w:tcMar>
+              <w:top w:type="dxa" w:w="80"/>
+              <w:left w:type="dxa" w:w="120"/>
+              <w:bottom w:type="dxa" w:w="80"/>
+              <w:right w:type="dxa" w:w="120"/>
+            </w:tcMar>
+          </w:tcPr>
+          <w:p>
+            <w:r>
+              <w:rPr>
+                <w:rFonts w:ascii="Arial" w:cs="Arial" w:eastAsia="Arial" w:hAnsi="Arial"/>
+                <w:color w:val="111827"/>
+                <w:sz w:val="20"/>
+                <w:szCs w:val="20"/>
+              </w:rPr>
+              <w:t xml:space="preserve">pending_review</w:t>
+            </w:r>
+          </w:p>
+        </w:tc>
+        <w:tc>
+          <w:tcPr>
+            <w:tcW w:type="dxa" w:w="3500"/>
+            <w:tcBorders>
+              <w:top w:val="single" w:color="E5E7EB" w:sz="1"/>
+              <w:left w:val="single" w:color="E5E7EB" w:sz="1"/>
+              <w:bottom w:val="single" w:color="E5E7EB" w:sz="1"/>
+              <w:right w:val="single" w:color="E5E7EB" w:sz="1"/>
+            </w:tcBorders>
+            <w:shd w:fill="F3F4F6" w:val="clear"/>
+            <w:tcMar>
+              <w:top w:type="dxa" w:w="80"/>
+              <w:left w:type="dxa" w:w="120"/>
+              <w:bottom w:type="dxa" w:w="80"/>
+              <w:right w:type="dxa" w:w="120"/>
+            </w:tcMar>
+          </w:tcPr>
+          <w:p>
+            <w:r>
+              <w:rPr>
+                <w:rFonts w:ascii="Arial" w:cs="Arial" w:eastAsia="Arial" w:hAnsi="Arial"/>
+                <w:color w:val="111827"/>
+                <w:sz w:val="20"/>
+                <w:szCs w:val="20"/>
+              </w:rPr>
+              <w:t xml:space="preserve">Ada kriteria yang tidak terpenuhi</w:t>
+            </w:r>
+          </w:p>
+        </w:tc>
+        <w:tc>
+          <w:tcPr>
+            <w:tcW w:type="dxa" w:w="3860"/>
+            <w:tcBorders>
+              <w:top w:val="single" w:color="E5E7EB" w:sz="1"/>
+              <w:left w:val="single" w:color="E5E7EB" w:sz="1"/>
+              <w:bottom w:val="single" w:color="E5E7EB" w:sz="1"/>
+              <w:right w:val="single" w:color="E5E7EB" w:sz="1"/>
+            </w:tcBorders>
+            <w:shd w:fill="F3F4F6" w:val="clear"/>
+            <w:tcMar>
+              <w:top w:type="dxa" w:w="80"/>
+              <w:left w:type="dxa" w:w="120"/>
+              <w:bottom w:type="dxa" w:w="80"/>
+              <w:right w:type="dxa" w:w="120"/>
+            </w:tcMar>
+          </w:tcPr>
+          <w:p>
+            <w:r>
+              <w:rPr>
+                <w:rFonts w:ascii="Arial" w:cs="Arial" w:eastAsia="Arial" w:hAnsi="Arial"/>
+                <w:color w:val="111827"/>
+                <w:sz w:val="20"/>
+                <w:szCs w:val="20"/>
+              </w:rPr>
+              <w:t xml:space="preserve">Tim platform mereview dalam 1x24 jam</w:t>
+            </w:r>
+          </w:p>
+        </w:tc>
+      </w:tr>
+      <w:tr>
+        <w:tc>
+          <w:tcPr>
+            <w:tcW w:type="dxa" w:w="2000"/>
+            <w:tcBorders>
+              <w:top w:val="single" w:color="E5E7EB" w:sz="1"/>
+              <w:left w:val="single" w:color="E5E7EB" w:sz="1"/>
+              <w:bottom w:val="single" w:color="E5E7EB" w:sz="1"/>
+              <w:right w:val="single" w:color="E5E7EB" w:sz="1"/>
+            </w:tcBorders>
+            <w:shd w:fill="FFFFFF" w:val="clear"/>
+            <w:tcMar>
+              <w:top w:type="dxa" w:w="80"/>
+              <w:left w:type="dxa" w:w="120"/>
+              <w:bottom w:type="dxa" w:w="80"/>
+              <w:right w:type="dxa" w:w="120"/>
+            </w:tcMar>
+          </w:tcPr>
+          <w:p>
+            <w:r>
+              <w:rPr>
+                <w:rFonts w:ascii="Arial" w:cs="Arial" w:eastAsia="Arial" w:hAnsi="Arial"/>
+                <w:color w:val="111827"/>
+                <w:sz w:val="20"/>
+                <w:szCs w:val="20"/>
+              </w:rPr>
+              <w:t xml:space="preserve">approved</w:t>
+            </w:r>
+          </w:p>
+        </w:tc>
+        <w:tc>
+          <w:tcPr>
+            <w:tcW w:type="dxa" w:w="3500"/>
+            <w:tcBorders>
+              <w:top w:val="single" w:color="E5E7EB" w:sz="1"/>
+              <w:left w:val="single" w:color="E5E7EB" w:sz="1"/>
+              <w:bottom w:val="single" w:color="E5E7EB" w:sz="1"/>
+              <w:right w:val="single" w:color="E5E7EB" w:sz="1"/>
+            </w:tcBorders>
+            <w:shd w:fill="FFFFFF" w:val="clear"/>
+            <w:tcMar>
+              <w:top w:type="dxa" w:w="80"/>
+              <w:left w:type="dxa" w:w="120"/>
+              <w:bottom w:type="dxa" w:w="80"/>
+              <w:right w:type="dxa" w:w="120"/>
+            </w:tcMar>
+          </w:tcPr>
+          <w:p>
+            <w:r>
+              <w:rPr>
+                <w:rFonts w:ascii="Arial" w:cs="Arial" w:eastAsia="Arial" w:hAnsi="Arial"/>
+                <w:color w:val="111827"/>
+                <w:sz w:val="20"/>
+                <w:szCs w:val="20"/>
+              </w:rPr>
+              <w:t xml:space="preserve">Tim platform menyetujui setelah review manual</w:t>
+            </w:r>
+          </w:p>
+        </w:tc>
+        <w:tc>
+          <w:tcPr>
+            <w:tcW w:type="dxa" w:w="3860"/>
+            <w:tcBorders>
+              <w:top w:val="single" w:color="E5E7EB" w:sz="1"/>
+              <w:left w:val="single" w:color="E5E7EB" w:sz="1"/>
+              <w:bottom w:val="single" w:color="E5E7EB" w:sz="1"/>
+              <w:right w:val="single" w:color="E5E7EB" w:sz="1"/>
+            </w:tcBorders>
+            <w:shd w:fill="FFFFFF" w:val="clear"/>
+            <w:tcMar>
+              <w:top w:type="dxa" w:w="80"/>
+              <w:left w:type="dxa" w:w="120"/>
+              <w:bottom w:type="dxa" w:w="80"/>
+              <w:right w:type="dxa" w:w="120"/>
+            </w:tcMar>
+          </w:tcPr>
+          <w:p>
+            <w:r>
+              <w:rPr>
+                <w:rFonts w:ascii="Arial" w:cs="Arial" w:eastAsia="Arial" w:hAnsi="Arial"/>
+                <w:color w:val="111827"/>
+                <w:sz w:val="20"/>
+                <w:szCs w:val="20"/>
+              </w:rPr>
+              <w:t xml:space="preserve">Berstatus draft, organizer bisa lanjut konfigurasi</w:t>
+            </w:r>
+          </w:p>
+        </w:tc>
+      </w:tr>
+      <w:tr>
+        <w:tc>
+          <w:tcPr>
+            <w:tcW w:type="dxa" w:w="2000"/>
+            <w:tcBorders>
+              <w:top w:val="single" w:color="E5E7EB" w:sz="1"/>
+              <w:left w:val="single" w:color="E5E7EB" w:sz="1"/>
+              <w:bottom w:val="single" w:color="E5E7EB" w:sz="1"/>
+              <w:right w:val="single" w:color="E5E7EB" w:sz="1"/>
+            </w:tcBorders>
+            <w:shd w:fill="F3F4F6" w:val="clear"/>
+            <w:tcMar>
+              <w:top w:type="dxa" w:w="80"/>
+              <w:left w:type="dxa" w:w="120"/>
+              <w:bottom w:type="dxa" w:w="80"/>
+              <w:right w:type="dxa" w:w="120"/>
+            </w:tcMar>
+          </w:tcPr>
+          <w:p>
+            <w:r>
+              <w:rPr>
+                <w:rFonts w:ascii="Arial" w:cs="Arial" w:eastAsia="Arial" w:hAnsi="Arial"/>
+                <w:color w:val="111827"/>
+                <w:sz w:val="20"/>
+                <w:szCs w:val="20"/>
+              </w:rPr>
+              <w:t xml:space="preserve">rejected</w:t>
+            </w:r>
+          </w:p>
+        </w:tc>
+        <w:tc>
+          <w:tcPr>
+            <w:tcW w:type="dxa" w:w="3500"/>
+            <w:tcBorders>
+              <w:top w:val="single" w:color="E5E7EB" w:sz="1"/>
+              <w:left w:val="single" w:color="E5E7EB" w:sz="1"/>
+              <w:bottom w:val="single" w:color="E5E7EB" w:sz="1"/>
+              <w:right w:val="single" w:color="E5E7EB" w:sz="1"/>
+            </w:tcBorders>
+            <w:shd w:fill="F3F4F6" w:val="clear"/>
+            <w:tcMar>
+              <w:top w:type="dxa" w:w="80"/>
+              <w:left w:type="dxa" w:w="120"/>
+              <w:bottom w:type="dxa" w:w="80"/>
+              <w:right w:type="dxa" w:w="120"/>
+            </w:tcMar>
+          </w:tcPr>
+          <w:p>
+            <w:r>
+              <w:rPr>
+                <w:rFonts w:ascii="Arial" w:cs="Arial" w:eastAsia="Arial" w:hAnsi="Arial"/>
+                <w:color w:val="111827"/>
+                <w:sz w:val="20"/>
+                <w:szCs w:val="20"/>
+              </w:rPr>
+              <w:t xml:space="preserve">Tim platform menolak dengan alasan tertentu</w:t>
+            </w:r>
+          </w:p>
+        </w:tc>
+        <w:tc>
+          <w:tcPr>
+            <w:tcW w:type="dxa" w:w="3860"/>
+            <w:tcBorders>
+              <w:top w:val="single" w:color="E5E7EB" w:sz="1"/>
+              <w:left w:val="single" w:color="E5E7EB" w:sz="1"/>
+              <w:bottom w:val="single" w:color="E5E7EB" w:sz="1"/>
+              <w:right w:val="single" w:color="E5E7EB" w:sz="1"/>
+            </w:tcBorders>
+            <w:shd w:fill="F3F4F6" w:val="clear"/>
+            <w:tcMar>
+              <w:top w:type="dxa" w:w="80"/>
+              <w:left w:type="dxa" w:w="120"/>
+              <w:bottom w:type="dxa" w:w="80"/>
+              <w:right w:type="dxa" w:w="120"/>
+            </w:tcMar>
+          </w:tcPr>
+          <w:p>
+            <w:r>
+              <w:rPr>
+                <w:rFonts w:ascii="Arial" w:cs="Arial" w:eastAsia="Arial" w:hAnsi="Arial"/>
+                <w:color w:val="111827"/>
+                <w:sz w:val="20"/>
+                <w:szCs w:val="20"/>
+              </w:rPr>
+              <w:t xml:space="preserve">Organizer mendapat notifikasi beserta alasan penolakan</w:t>
+            </w:r>
+          </w:p>
+        </w:tc>
+      </w:tr>
+    </w:tbl>
+    <w:p>
+      <w:pPr>
+        <w:spacing w:before="0" w:after="0"/>
+      </w:pPr>
+      <w:r>
+        <w:rPr>
+          <w:rFonts w:ascii="Arial" w:cs="Arial" w:eastAsia="Arial" w:hAnsi="Arial"/>
+          <w:sz w:val="22"/>
+          <w:szCs w:val="22"/>
+        </w:rPr>
+        <w:t xml:space="preserve"/>
+      </w:r>
+    </w:p>
+    <w:p>
+      <w:r>
+        <w:br w:type="page"/>
+      </w:r>
+    </w:p>
+    <w:p>
+      <w:pPr>
+        <w:pStyle w:val="Heading1"/>
+        <w:pBdr>
+          <w:bottom w:val="single" w:color="1A56DB" w:sz="4" w:space="4"/>
+        </w:pBdr>
+        <w:spacing w:before="400" w:after="200"/>
+      </w:pPr>
+      <w:r>
+        <w:rPr>
+          <w:rFonts w:ascii="Arial" w:cs="Arial" w:eastAsia="Arial" w:hAnsi="Arial"/>
+          <w:b/>
+          <w:bCs/>
+          <w:color w:val="1A56DB"/>
+          <w:sz w:val="32"/>
+          <w:szCs w:val="32"/>
+        </w:rPr>
+        <w:t xml:space="preserve">8. Roadmap Produk</w:t>
       </w:r>
     </w:p>
     <w:tbl>
@@ -6974,7 +8960,7 @@
                 <w:sz w:val="20"/>
                 <w:szCs w:val="20"/>
               </w:rPr>
-              <w:t xml:space="preserve">Manajemen turnamen dasar, semua format, public bracket, notifikasi email &amp; in-app, manajemen tim</w:t>
+              <w:t xml:space="preserve">Manajemen turnamen lengkap, semua format, public bracket, notifikasi email &amp; in-app, manajemen tim, sistem approval Free tier</w:t>
             </w:r>
           </w:p>
         </w:tc>
@@ -7063,7 +9049,7 @@
                 <w:sz w:val="20"/>
                 <w:szCs w:val="20"/>
               </w:rPr>
-              <w:t xml:space="preserve">Payment gateway (Midtrans/Xendit), notifikasi WhatsApp/Telegram, statistik peserta, leaderboard</w:t>
+              <w:t xml:space="preserve">Subscription Pro (billing), payment gateway entry fee (Midtrans/Xendit), notifikasi WhatsApp/Telegram, statistik peserta</w:t>
             </w:r>
           </w:p>
         </w:tc>
@@ -7123,7 +9109,7 @@
                 <w:sz w:val="20"/>
                 <w:szCs w:val="20"/>
               </w:rPr>
-              <w:t xml:space="preserve">V3 - SaaS</w:t>
+              <w:t xml:space="preserve">V3 - Scale</w:t>
             </w:r>
           </w:p>
         </w:tc>
@@ -7152,7 +9138,7 @@
                 <w:sz w:val="20"/>
                 <w:szCs w:val="20"/>
               </w:rPr>
-              <w:t xml:space="preserve">Tier berbayar, white-label, custom domain, API publik, dashboard analytics organizer</w:t>
+              <w:t xml:space="preserve">Custom domain, white-label, API publik, dashboard analytics organizer, Enterprise tier</w:t>
             </w:r>
           </w:p>
         </w:tc>
@@ -7181,7 +9167,7 @@
                 <w:sz w:val="20"/>
                 <w:szCs w:val="20"/>
               </w:rPr>
-              <w:t xml:space="preserve">Fase monetisasi</w:t>
+              <w:t xml:space="preserve">Fase monetisasi penuh</w:t>
             </w:r>
           </w:p>
         </w:tc>

</xml_diff>